<commit_message>
fixing truefiling file and serve for changing custody order and possibly changing child support as well
</commit_message>
<xml_diff>
--- a/docassemble/AKA2JBranding/data/templates/truefiling_file_and_serve_content.docx
+++ b/docassemble/AKA2JBranding/data/templates/truefiling_file_and_serve_content.docx
@@ -418,21 +418,7 @@
             <w:rStyle w:val="Hyperlink"/>
             <w:spacing w:val="0"/>
           </w:rPr>
-          <w:t>Create an acco</w:t>
-        </w:r>
-        <w:r>
-          <w:rPr>
-            <w:rStyle w:val="Hyperlink"/>
-            <w:spacing w:val="0"/>
-          </w:rPr>
-          <w:t>u</w:t>
-        </w:r>
-        <w:r>
-          <w:rPr>
-            <w:rStyle w:val="Hyperlink"/>
-            <w:spacing w:val="0"/>
-          </w:rPr>
-          <w:t>nt</w:t>
+          <w:t>Create an account</w:t>
         </w:r>
       </w:hyperlink>
       <w:r>
@@ -457,21 +443,7 @@
             <w:rStyle w:val="Hyperlink"/>
             <w:spacing w:val="0"/>
           </w:rPr>
-          <w:t>True</w:t>
-        </w:r>
-        <w:r>
-          <w:rPr>
-            <w:rStyle w:val="Hyperlink"/>
-            <w:spacing w:val="0"/>
-          </w:rPr>
-          <w:t>F</w:t>
-        </w:r>
-        <w:r>
-          <w:rPr>
-            <w:rStyle w:val="Hyperlink"/>
-            <w:spacing w:val="0"/>
-          </w:rPr>
-          <w:t>iling</w:t>
+          <w:t>TrueFiling</w:t>
         </w:r>
       </w:hyperlink>
     </w:p>
@@ -495,7 +467,39 @@
         <w:rPr>
           <w:color w:val="FF0000"/>
         </w:rPr>
-        <w:t xml:space="preserve"> if user_need in ('custody', 'divorce', 'change AK order', 'change divorce order', 'change custody order', 'change foreign custody order') %}</w:t>
+        <w:t xml:space="preserve"> </w:t>
+      </w:r>
+      <w:r>
+        <w:rPr>
+          <w:color w:val="FF0000"/>
+        </w:rPr>
+        <w:t>if user_need in('custody', '</w:t>
+      </w:r>
+      <w:proofErr w:type="spellStart"/>
+      <w:r>
+        <w:rPr>
+          <w:color w:val="FF0000"/>
+        </w:rPr>
+        <w:t>divorce','change</w:t>
+      </w:r>
+      <w:proofErr w:type="spellEnd"/>
+      <w:r>
+        <w:rPr>
+          <w:color w:val="FF0000"/>
+        </w:rPr>
+        <w:t xml:space="preserve"> foreign custody order') or (user_need in ('change AK order', 'change divorce order', 'change custody order') and middle_of_case == 'no' and ((type_of_final_order['custody order'] and why_change in('review', 'schedule')) or (user_need == 'change divorce order' and type_of_final_order['spousal support'] and why_change_divorce_order == 'changed circumstances')))</w:t>
+      </w:r>
+      <w:r>
+        <w:rPr>
+          <w:color w:val="FF0000"/>
+        </w:rPr>
+        <w:t xml:space="preserve"> </w:t>
+      </w:r>
+      <w:r>
+        <w:rPr>
+          <w:color w:val="FF0000"/>
+        </w:rPr>
+        <w:t>%}</w:t>
       </w:r>
     </w:p>
     <w:p>
@@ -622,21 +626,7 @@
             <w:rStyle w:val="Hyperlink"/>
             <w:spacing w:val="0"/>
           </w:rPr>
-          <w:t>Fill</w:t>
-        </w:r>
-        <w:r>
-          <w:rPr>
-            <w:rStyle w:val="Hyperlink"/>
-            <w:spacing w:val="0"/>
-          </w:rPr>
-          <w:t>-</w:t>
-        </w:r>
-        <w:r>
-          <w:rPr>
-            <w:rStyle w:val="Hyperlink"/>
-            <w:spacing w:val="0"/>
-          </w:rPr>
-          <w:t>In PDF</w:t>
+          <w:t>Fill-In PDF</w:t>
         </w:r>
       </w:hyperlink>
       <w:r>
@@ -719,6 +709,7 @@
         </w:numPr>
       </w:pPr>
       <w:r>
+        <w:lastRenderedPageBreak/>
         <w:t>a “Standing Order.”  The Standing Order has important information about your case. Usually, the clerk will give you this order when you file.</w:t>
       </w:r>
     </w:p>
@@ -741,7 +732,6 @@
         <w:rPr>
           <w:color w:val="FFC000"/>
         </w:rPr>
-        <w:lastRenderedPageBreak/>
         <w:t>{%</w:t>
       </w:r>
       <w:r>
@@ -939,21 +929,7 @@
             <w:rStyle w:val="Hyperlink"/>
             <w:spacing w:val="0"/>
           </w:rPr>
-          <w:t>ak-courts.</w:t>
-        </w:r>
-        <w:r>
-          <w:rPr>
-            <w:rStyle w:val="Hyperlink"/>
-            <w:spacing w:val="0"/>
-          </w:rPr>
-          <w:t>i</w:t>
-        </w:r>
-        <w:r>
-          <w:rPr>
-            <w:rStyle w:val="Hyperlink"/>
-            <w:spacing w:val="0"/>
-          </w:rPr>
-          <w:t>nfo/</w:t>
+          <w:t>ak-courts.info/</w:t>
         </w:r>
         <w:proofErr w:type="spellStart"/>
         <w:r>

</xml_diff>